<commit_message>
Polish submission materials and CI
</commit_message>
<xml_diff>
--- a/docs/任务报告书-卓娟-bech32-kit.docx
+++ b/docs/任务报告书-卓娟-bech32-kit.docx
@@ -127,7 +127,7 @@
                 <w:b/>
                 <w:sz w:val="20"/>
               </w:rPr>
-              <w:t>联系电话</w:t>
+              <w:t>联系方式</w:t>
             </w:r>
           </w:p>
         </w:tc>
@@ -154,64 +154,7 @@
                 <w:b w:val="0"/>
                 <w:sz w:val="20"/>
               </w:rPr>
-              <w:t>13855703757</w:t>
-            </w:r>
-          </w:p>
-        </w:tc>
-      </w:tr>
-      <w:tr>
-        <w:tc>
-          <w:tcPr>
-            <w:tcW w:type="dxa" w:w="2700"/>
-            <w:tcMar>
-              <w:top w:w="80" w:type="dxa"/>
-              <w:start w:w="120" w:type="dxa"/>
-              <w:bottom w:w="80" w:type="dxa"/>
-              <w:end w:w="120" w:type="dxa"/>
-            </w:tcMar>
-            <w:vAlign w:val="center"/>
-            <w:shd w:fill="F2F4F7"/>
-          </w:tcPr>
-          <w:p>
-            <w:pPr>
-              <w:spacing w:after="0"/>
-              <w:jc w:val="left"/>
-            </w:pPr>
-            <w:r/>
-            <w:r>
-              <w:rPr>
-                <w:rFonts w:ascii="Calibri" w:hAnsi="Calibri" w:eastAsia="Microsoft YaHei"/>
-                <w:b/>
-                <w:sz w:val="20"/>
-              </w:rPr>
-              <w:t>邮箱</w:t>
-            </w:r>
-          </w:p>
-        </w:tc>
-        <w:tc>
-          <w:tcPr>
-            <w:tcW w:type="dxa" w:w="6660"/>
-            <w:tcMar>
-              <w:top w:w="80" w:type="dxa"/>
-              <w:start w:w="120" w:type="dxa"/>
-              <w:bottom w:w="80" w:type="dxa"/>
-              <w:end w:w="120" w:type="dxa"/>
-            </w:tcMar>
-            <w:vAlign w:val="center"/>
-          </w:tcPr>
-          <w:p>
-            <w:pPr>
-              <w:spacing w:after="0"/>
-              <w:jc w:val="left"/>
-            </w:pPr>
-            <w:r/>
-            <w:r>
-              <w:rPr>
-                <w:rFonts w:ascii="Calibri" w:hAnsi="Calibri" w:eastAsia="Microsoft YaHei"/>
-                <w:b w:val="0"/>
-                <w:sz w:val="20"/>
-              </w:rPr>
-              <w:t>609588498@qq.com</w:t>
+              <w:t>见飞书报名表 / 正式提交材料</w:t>
             </w:r>
           </w:p>
         </w:tc>
@@ -950,7 +893,22 @@
           <w:b w:val="0"/>
           <w:sz w:val="22"/>
         </w:rPr>
-        <w:t>执行 moon check。</w:t>
+        <w:t>执行 moon fmt --check。</w:t>
+      </w:r>
+    </w:p>
+    <w:p>
+      <w:pPr>
+        <w:pStyle w:val="ListNumber"/>
+        <w:spacing w:after="160" w:line="280" w:lineRule="auto"/>
+        <w:ind w:left="720" w:hanging="360"/>
+      </w:pPr>
+      <w:r>
+        <w:rPr>
+          <w:rFonts w:ascii="Calibri" w:hAnsi="Calibri" w:eastAsia="Microsoft YaHei"/>
+          <w:b w:val="0"/>
+          <w:sz w:val="22"/>
+        </w:rPr>
+        <w:t>执行 moon check --deny-warn。</w:t>
       </w:r>
     </w:p>
     <w:p>
@@ -980,7 +938,22 @@
           <w:b w:val="0"/>
           <w:sz w:val="22"/>
         </w:rPr>
-        <w:t>执行 moon test。</w:t>
+        <w:t>执行 moon test --deny-warn。</w:t>
+      </w:r>
+    </w:p>
+    <w:p>
+      <w:pPr>
+        <w:pStyle w:val="ListNumber"/>
+        <w:spacing w:after="160" w:line="280" w:lineRule="auto"/>
+        <w:ind w:left="720" w:hanging="360"/>
+      </w:pPr>
+      <w:r>
+        <w:rPr>
+          <w:rFonts w:ascii="Calibri" w:hAnsi="Calibri" w:eastAsia="Microsoft YaHei"/>
+          <w:b w:val="0"/>
+          <w:sz w:val="22"/>
+        </w:rPr>
+        <w:t>执行 moon info。</w:t>
       </w:r>
     </w:p>
     <w:p>

</xml_diff>